<commit_message>
chore: remove obsolete video script, image, and Gantt chart documents
</commit_message>
<xml_diff>
--- a/examen.docx
+++ b/examen.docx
@@ -1,6 +1,6 @@
 
 <file path=word/document.xml><?xml version="1.0" encoding="utf-8"?>
-<w:document xmlns:wpc="http://schemas.microsoft.com/office/word/2010/wordprocessingCanvas" xmlns:cx="http://schemas.microsoft.com/office/drawing/2014/chartex" xmlns:cx1="http://schemas.microsoft.com/office/drawing/2015/9/8/chartex" xmlns:cx2="http://schemas.microsoft.com/office/drawing/2015/10/21/chartex" xmlns:cx3="http://schemas.microsoft.com/office/drawing/2016/5/9/chartex" xmlns:cx4="http://schemas.microsoft.com/office/drawing/2016/5/10/chartex" xmlns:cx5="http://schemas.microsoft.com/office/drawing/2016/5/11/chartex" xmlns:cx6="http://schemas.microsoft.com/office/drawing/2016/5/12/chartex" xmlns:cx7="http://schemas.microsoft.com/office/drawing/2016/5/13/chartex" xmlns:cx8="http://schemas.microsoft.com/office/drawing/2016/5/14/chartex" xmlns:mc="http://schemas.openxmlformats.org/markup-compatibility/2006" xmlns:m="http://schemas.openxmlformats.org/officeDocument/2006/math" xmlns:aink="http://schemas.microsoft.com/office/drawing/2016/ink" xmlns:am3d="http://schemas.microsoft.com/office/drawing/2017/model3d" xmlns:oel="http://schemas.microsoft.com/office/2019/extlst" xmlns:r="http://schemas.openxmlformats.org/officeDocument/2006/relationships" xmlns:wp14="http://schemas.microsoft.com/office/word/2010/wordprocessingDrawing" xmlns:wp="http://schemas.openxmlformats.org/drawingml/2006/wordprocessingDrawing" xmlns:wpg="http://schemas.microsoft.com/office/word/2010/wordprocessingGroup" xmlns:wpi="http://schemas.microsoft.com/office/word/2010/wordprocessingInk" xmlns:wps="http://schemas.microsoft.com/office/word/2010/wordprocessingShape" xmlns:o="urn:schemas-microsoft-com:office:office" xmlns:v="urn:schemas-microsoft-com:vml" xmlns:w10="urn:schemas-microsoft-com:office:word" xmlns:w="http://schemas.openxmlformats.org/wordprocessingml/2006/main" xmlns:w14="http://schemas.microsoft.com/office/word/2010/wordml" xmlns:w15="http://schemas.microsoft.com/office/word/2012/wordml" xmlns:w16cex="http://schemas.microsoft.com/office/word/2018/wordml/cex" xmlns:w16cid="http://schemas.microsoft.com/office/word/2016/wordml/cid" xmlns:w16="http://schemas.microsoft.com/office/word/2018/wordml" xmlns:w16sdtdh="http://schemas.microsoft.com/office/word/2020/wordml/sdtdatahash" xmlns:w16sdtfl="http://schemas.microsoft.com/office/word/2024/wordml/sdtformatlock" xmlns:w16se="http://schemas.microsoft.com/office/word/2015/wordml/symex" xmlns:w16du="http://schemas.microsoft.com/office/word/2023/wordml/word16du" xmlns:wne="http://schemas.microsoft.com/office/word/2006/wordml" mc:Ignorable="w14 w15 w16se w16cid w16 w16cex w16sdtdh w16sdtfl w16du wp14">
+<w:document xmlns:mc="http://schemas.openxmlformats.org/markup-compatibility/2006" xmlns:w="http://schemas.openxmlformats.org/wordprocessingml/2006/main" xmlns:w14="http://schemas.microsoft.com/office/word/2010/wordml" mc:Ignorable="w14 w15 w16se w16cid w16 w16cex w16sdtdh w16sdtfl w16du wp14">
   <w:body>
     <w:p>
       <w:pPr>
@@ -1741,6 +1741,663 @@
     </w:p>
     <w:p>
       <w:pPr>
+        <w:spacing w:before="200" w:after="120"/>
+      </w:pPr>
+      <w:r>
+        <w:rPr>
+          <w:rFonts w:ascii="Arial" w:hAnsi="Arial" w:cs="Arial"/>
+          <w:b/>
+        </w:rPr>
+        <w:t xml:space="preserve">1.9 Matriz de trazabilidad: Requisitos ↔ Casos de prueba (RF1–RF8)</w:t>
+      </w:r>
+    </w:p>
+    <w:tbl>
+      <w:tblPr>
+        <w:tblW w:type="auto" w:w="0"/>
+        <w:tblLook w:firstColumn="1" w:firstRow="1" w:lastColumn="0" w:lastRow="0" w:noHBand="0" w:noVBand="1" w:val="04A0"/>
+        <w:tblBorders>
+          <w:top w:val="single" w:sz="4" w:color="auto"/>
+          <w:left w:val="single" w:sz="4" w:color="auto"/>
+          <w:bottom w:val="single" w:sz="4" w:color="auto"/>
+          <w:right w:val="single" w:sz="4" w:color="auto"/>
+          <w:insideH w:val="single" w:sz="4" w:color="auto"/>
+          <w:insideV w:val="single" w:sz="4" w:color="auto"/>
+        </w:tblBorders>
+      </w:tblPr>
+      <w:tblGrid>
+        <w:gridCol w:w="1968"/>
+        <w:gridCol w:w="1968"/>
+        <w:gridCol w:w="1968"/>
+        <w:gridCol w:w="1968"/>
+        <w:gridCol w:w="1968"/>
+      </w:tblGrid>
+      <w:tr>
+        <w:tc>
+          <w:tcPr>
+            <w:tcW w:type="dxa" w:w="1474"/>
+            <w:shd w:val="clear" w:color="auto" w:fill="EDEDED"/>
+          </w:tcPr>
+          <w:p>
+            <w:r>
+              <w:rPr>
+                <w:rFonts w:ascii="Arial" w:hAnsi="Arial" w:cs="Arial"/>
+                <w:b/>
+              </w:rPr>
+              <w:t xml:space="preserve">RF</w:t>
+            </w:r>
+          </w:p>
+        </w:tc>
+        <w:tc>
+          <w:tcPr>
+            <w:tcW w:type="dxa" w:w="1474"/>
+            <w:shd w:val="clear" w:color="auto" w:fill="EDEDED"/>
+          </w:tcPr>
+          <w:p>
+            <w:r>
+              <w:rPr>
+                <w:rFonts w:ascii="Arial" w:hAnsi="Arial" w:cs="Arial"/>
+                <w:b/>
+              </w:rPr>
+              <w:t xml:space="preserve">Requisito funcional</w:t>
+            </w:r>
+          </w:p>
+        </w:tc>
+        <w:tc>
+          <w:tcPr>
+            <w:tcW w:type="dxa" w:w="4082"/>
+            <w:shd w:val="clear" w:color="auto" w:fill="EDEDED"/>
+          </w:tcPr>
+          <w:p>
+            <w:r>
+              <w:rPr>
+                <w:rFonts w:ascii="Arial" w:hAnsi="Arial" w:cs="Arial"/>
+                <w:b/>
+              </w:rPr>
+              <w:t xml:space="preserve">Caso(s) de prueba</w:t>
+            </w:r>
+          </w:p>
+        </w:tc>
+        <w:tc>
+          <w:tcPr>
+            <w:tcW w:type="dxa" w:w="1134"/>
+            <w:shd w:val="clear" w:color="auto" w:fill="EDEDED"/>
+          </w:tcPr>
+          <w:p>
+            <w:r>
+              <w:rPr>
+                <w:rFonts w:ascii="Arial" w:hAnsi="Arial" w:cs="Arial"/>
+                <w:b/>
+              </w:rPr>
+              <w:t xml:space="preserve">Tipo</w:t>
+            </w:r>
+          </w:p>
+        </w:tc>
+        <w:tc>
+          <w:tcPr>
+            <w:tcW w:type="dxa" w:w="1361"/>
+            <w:shd w:val="clear" w:color="auto" w:fill="EDEDED"/>
+          </w:tcPr>
+          <w:p>
+            <w:r>
+              <w:rPr>
+                <w:rFonts w:ascii="Arial" w:hAnsi="Arial" w:cs="Arial"/>
+                <w:b/>
+              </w:rPr>
+              <w:t xml:space="preserve">Resultado</w:t>
+            </w:r>
+          </w:p>
+        </w:tc>
+      </w:tr>
+      <w:tr>
+        <w:tc>
+          <w:tcPr>
+            <w:tcW w:type="dxa" w:w="1474"/>
+          </w:tcPr>
+          <w:p>
+            <w:r>
+              <w:rPr>
+                <w:rFonts w:ascii="Arial" w:hAnsi="Arial" w:cs="Arial"/>
+              </w:rPr>
+              <w:t xml:space="preserve">RF1</w:t>
+            </w:r>
+          </w:p>
+        </w:tc>
+        <w:tc>
+          <w:tcPr>
+            <w:tcW w:type="dxa" w:w="1474"/>
+          </w:tcPr>
+          <w:p>
+            <w:r>
+              <w:rPr>
+                <w:rFonts w:ascii="Arial" w:hAnsi="Arial" w:cs="Arial"/>
+              </w:rPr>
+              <w:t xml:space="preserve">Crear producto (nombre, precio de compra, precio de venta y stock)</w:t>
+            </w:r>
+          </w:p>
+        </w:tc>
+        <w:tc>
+          <w:tcPr>
+            <w:tcW w:type="dxa" w:w="4082"/>
+          </w:tcPr>
+          <w:p>
+            <w:r>
+              <w:rPr>
+                <w:rFonts w:ascii="Arial" w:hAnsi="Arial" w:cs="Arial"/>
+              </w:rPr>
+              <w:t xml:space="preserve">CP-PROD-001, CP-PROD-004</w:t>
+            </w:r>
+          </w:p>
+        </w:tc>
+        <w:tc>
+          <w:tcPr>
+            <w:tcW w:type="dxa" w:w="1134"/>
+          </w:tcPr>
+          <w:p>
+            <w:r>
+              <w:rPr>
+                <w:rFonts w:ascii="Arial" w:hAnsi="Arial" w:cs="Arial"/>
+              </w:rPr>
+              <w:t xml:space="preserve">Negra / Blanca</w:t>
+            </w:r>
+          </w:p>
+        </w:tc>
+        <w:tc>
+          <w:tcPr>
+            <w:tcW w:type="dxa" w:w="1361"/>
+          </w:tcPr>
+          <w:p>
+            <w:r>
+              <w:rPr>
+                <w:rFonts w:ascii="Arial" w:hAnsi="Arial" w:cs="Arial"/>
+              </w:rPr>
+              <w:t xml:space="preserve">Aprobado</w:t>
+            </w:r>
+          </w:p>
+        </w:tc>
+      </w:tr>
+      <w:tr>
+        <w:tc>
+          <w:tcPr>
+            <w:tcW w:type="dxa" w:w="1474"/>
+          </w:tcPr>
+          <w:p>
+            <w:r>
+              <w:rPr>
+                <w:rFonts w:ascii="Arial" w:hAnsi="Arial" w:cs="Arial"/>
+              </w:rPr>
+              <w:t xml:space="preserve">RF2</w:t>
+            </w:r>
+          </w:p>
+        </w:tc>
+        <w:tc>
+          <w:tcPr>
+            <w:tcW w:type="dxa" w:w="1474"/>
+          </w:tcPr>
+          <w:p>
+            <w:r>
+              <w:rPr>
+                <w:rFonts w:ascii="Arial" w:hAnsi="Arial" w:cs="Arial"/>
+              </w:rPr>
+              <w:t xml:space="preserve">Actualizar / editar un producto existente</w:t>
+            </w:r>
+          </w:p>
+        </w:tc>
+        <w:tc>
+          <w:tcPr>
+            <w:tcW w:type="dxa" w:w="4082"/>
+          </w:tcPr>
+          <w:p>
+            <w:r>
+              <w:rPr>
+                <w:rFonts w:ascii="Arial" w:hAnsi="Arial" w:cs="Arial"/>
+              </w:rPr>
+              <w:t xml:space="preserve">CP-PROD-002</w:t>
+            </w:r>
+          </w:p>
+        </w:tc>
+        <w:tc>
+          <w:tcPr>
+            <w:tcW w:type="dxa" w:w="1134"/>
+          </w:tcPr>
+          <w:p>
+            <w:r>
+              <w:rPr>
+                <w:rFonts w:ascii="Arial" w:hAnsi="Arial" w:cs="Arial"/>
+              </w:rPr>
+              <w:t xml:space="preserve">Negra</w:t>
+            </w:r>
+          </w:p>
+        </w:tc>
+        <w:tc>
+          <w:tcPr>
+            <w:tcW w:type="dxa" w:w="1361"/>
+          </w:tcPr>
+          <w:p>
+            <w:r>
+              <w:rPr>
+                <w:rFonts w:ascii="Arial" w:hAnsi="Arial" w:cs="Arial"/>
+              </w:rPr>
+              <w:t xml:space="preserve">Aprobado</w:t>
+            </w:r>
+          </w:p>
+        </w:tc>
+      </w:tr>
+      <w:tr>
+        <w:tc>
+          <w:tcPr>
+            <w:tcW w:type="dxa" w:w="1474"/>
+          </w:tcPr>
+          <w:p>
+            <w:r>
+              <w:rPr>
+                <w:rFonts w:ascii="Arial" w:hAnsi="Arial" w:cs="Arial"/>
+              </w:rPr>
+              <w:t xml:space="preserve">RF3</w:t>
+            </w:r>
+          </w:p>
+        </w:tc>
+        <w:tc>
+          <w:tcPr>
+            <w:tcW w:type="dxa" w:w="1474"/>
+          </w:tcPr>
+          <w:p>
+            <w:r>
+              <w:rPr>
+                <w:rFonts w:ascii="Arial" w:hAnsi="Arial" w:cs="Arial"/>
+              </w:rPr>
+              <w:t xml:space="preserve">Eliminar un producto del catálogo</w:t>
+            </w:r>
+          </w:p>
+        </w:tc>
+        <w:tc>
+          <w:tcPr>
+            <w:tcW w:type="dxa" w:w="4082"/>
+          </w:tcPr>
+          <w:p>
+            <w:r>
+              <w:rPr>
+                <w:rFonts w:ascii="Arial" w:hAnsi="Arial" w:cs="Arial"/>
+              </w:rPr>
+              <w:t xml:space="preserve">CP-PROD-003</w:t>
+            </w:r>
+          </w:p>
+        </w:tc>
+        <w:tc>
+          <w:tcPr>
+            <w:tcW w:type="dxa" w:w="1134"/>
+          </w:tcPr>
+          <w:p>
+            <w:r>
+              <w:rPr>
+                <w:rFonts w:ascii="Arial" w:hAnsi="Arial" w:cs="Arial"/>
+              </w:rPr>
+              <w:t xml:space="preserve">Negra</w:t>
+            </w:r>
+          </w:p>
+        </w:tc>
+        <w:tc>
+          <w:tcPr>
+            <w:tcW w:type="dxa" w:w="1361"/>
+          </w:tcPr>
+          <w:p>
+            <w:r>
+              <w:rPr>
+                <w:rFonts w:ascii="Arial" w:hAnsi="Arial" w:cs="Arial"/>
+              </w:rPr>
+              <w:t xml:space="preserve">Aprobado</w:t>
+            </w:r>
+          </w:p>
+        </w:tc>
+      </w:tr>
+      <w:tr>
+        <w:tc>
+          <w:tcPr>
+            <w:tcW w:type="dxa" w:w="1474"/>
+          </w:tcPr>
+          <w:p>
+            <w:r>
+              <w:rPr>
+                <w:rFonts w:ascii="Arial" w:hAnsi="Arial" w:cs="Arial"/>
+              </w:rPr>
+              <w:t xml:space="preserve">RF4</w:t>
+            </w:r>
+          </w:p>
+        </w:tc>
+        <w:tc>
+          <w:tcPr>
+            <w:tcW w:type="dxa" w:w="1474"/>
+          </w:tcPr>
+          <w:p>
+            <w:r>
+              <w:rPr>
+                <w:rFonts w:ascii="Arial" w:hAnsi="Arial" w:cs="Arial"/>
+              </w:rPr>
+              <w:t xml:space="preserve">Mostrar el stock disponible en tiempo real</w:t>
+            </w:r>
+          </w:p>
+        </w:tc>
+        <w:tc>
+          <w:tcPr>
+            <w:tcW w:type="dxa" w:w="4082"/>
+          </w:tcPr>
+          <w:p>
+            <w:r>
+              <w:rPr>
+                <w:rFonts w:ascii="Arial" w:hAnsi="Arial" w:cs="Arial"/>
+              </w:rPr>
+              <w:t xml:space="preserve">CP-PROD-001</w:t>
+            </w:r>
+          </w:p>
+        </w:tc>
+        <w:tc>
+          <w:tcPr>
+            <w:tcW w:type="dxa" w:w="1134"/>
+          </w:tcPr>
+          <w:p>
+            <w:r>
+              <w:rPr>
+                <w:rFonts w:ascii="Arial" w:hAnsi="Arial" w:cs="Arial"/>
+              </w:rPr>
+              <w:t xml:space="preserve">Negra</w:t>
+            </w:r>
+          </w:p>
+        </w:tc>
+        <w:tc>
+          <w:tcPr>
+            <w:tcW w:type="dxa" w:w="1361"/>
+          </w:tcPr>
+          <w:p>
+            <w:r>
+              <w:rPr>
+                <w:rFonts w:ascii="Arial" w:hAnsi="Arial" w:cs="Arial"/>
+              </w:rPr>
+              <w:t xml:space="preserve">Aprobado</w:t>
+            </w:r>
+          </w:p>
+        </w:tc>
+      </w:tr>
+      <w:tr>
+        <w:tc>
+          <w:tcPr>
+            <w:tcW w:type="dxa" w:w="1474"/>
+          </w:tcPr>
+          <w:p>
+            <w:r>
+              <w:rPr>
+                <w:rFonts w:ascii="Arial" w:hAnsi="Arial" w:cs="Arial"/>
+              </w:rPr>
+              <w:t xml:space="preserve">RF5</w:t>
+            </w:r>
+          </w:p>
+        </w:tc>
+        <w:tc>
+          <w:tcPr>
+            <w:tcW w:type="dxa" w:w="1474"/>
+          </w:tcPr>
+          <w:p>
+            <w:r>
+              <w:rPr>
+                <w:rFonts w:ascii="Arial" w:hAnsi="Arial" w:cs="Arial"/>
+              </w:rPr>
+              <w:t xml:space="preserve">Calcular la ganancia individual (venta − compra)</w:t>
+            </w:r>
+          </w:p>
+        </w:tc>
+        <w:tc>
+          <w:tcPr>
+            <w:tcW w:type="dxa" w:w="4082"/>
+          </w:tcPr>
+          <w:p>
+            <w:r>
+              <w:rPr>
+                <w:rFonts w:ascii="Arial" w:hAnsi="Arial" w:cs="Arial"/>
+              </w:rPr>
+              <w:t xml:space="preserve">CP-GAN-001, CP-GAN-003</w:t>
+            </w:r>
+          </w:p>
+        </w:tc>
+        <w:tc>
+          <w:tcPr>
+            <w:tcW w:type="dxa" w:w="1134"/>
+          </w:tcPr>
+          <w:p>
+            <w:r>
+              <w:rPr>
+                <w:rFonts w:ascii="Arial" w:hAnsi="Arial" w:cs="Arial"/>
+              </w:rPr>
+              <w:t xml:space="preserve">Blanca</w:t>
+            </w:r>
+          </w:p>
+        </w:tc>
+        <w:tc>
+          <w:tcPr>
+            <w:tcW w:type="dxa" w:w="1361"/>
+          </w:tcPr>
+          <w:p>
+            <w:r>
+              <w:rPr>
+                <w:rFonts w:ascii="Arial" w:hAnsi="Arial" w:cs="Arial"/>
+              </w:rPr>
+              <w:t xml:space="preserve">Aprobado</w:t>
+            </w:r>
+          </w:p>
+        </w:tc>
+      </w:tr>
+      <w:tr>
+        <w:tc>
+          <w:tcPr>
+            <w:tcW w:type="dxa" w:w="1474"/>
+          </w:tcPr>
+          <w:p>
+            <w:r>
+              <w:rPr>
+                <w:rFonts w:ascii="Arial" w:hAnsi="Arial" w:cs="Arial"/>
+              </w:rPr>
+              <w:t xml:space="preserve">RF6</w:t>
+            </w:r>
+          </w:p>
+        </w:tc>
+        <w:tc>
+          <w:tcPr>
+            <w:tcW w:type="dxa" w:w="1474"/>
+          </w:tcPr>
+          <w:p>
+            <w:r>
+              <w:rPr>
+                <w:rFonts w:ascii="Arial" w:hAnsi="Arial" w:cs="Arial"/>
+              </w:rPr>
+              <w:t xml:space="preserve">Buscar un producto por nombre (precio y stock)</w:t>
+            </w:r>
+          </w:p>
+        </w:tc>
+        <w:tc>
+          <w:tcPr>
+            <w:tcW w:type="dxa" w:w="4082"/>
+          </w:tcPr>
+          <w:p>
+            <w:r>
+              <w:rPr>
+                <w:rFonts w:ascii="Arial" w:hAnsi="Arial" w:cs="Arial"/>
+              </w:rPr>
+              <w:t xml:space="preserve">CP-PROD-001</w:t>
+            </w:r>
+          </w:p>
+        </w:tc>
+        <w:tc>
+          <w:tcPr>
+            <w:tcW w:type="dxa" w:w="1134"/>
+          </w:tcPr>
+          <w:p>
+            <w:r>
+              <w:rPr>
+                <w:rFonts w:ascii="Arial" w:hAnsi="Arial" w:cs="Arial"/>
+              </w:rPr>
+              <w:t xml:space="preserve">Negra</w:t>
+            </w:r>
+          </w:p>
+        </w:tc>
+        <w:tc>
+          <w:tcPr>
+            <w:tcW w:type="dxa" w:w="1361"/>
+          </w:tcPr>
+          <w:p>
+            <w:r>
+              <w:rPr>
+                <w:rFonts w:ascii="Arial" w:hAnsi="Arial" w:cs="Arial"/>
+              </w:rPr>
+              <w:t xml:space="preserve">Aprobado</w:t>
+            </w:r>
+          </w:p>
+        </w:tc>
+      </w:tr>
+      <w:tr>
+        <w:tc>
+          <w:tcPr>
+            <w:tcW w:type="dxa" w:w="1474"/>
+          </w:tcPr>
+          <w:p>
+            <w:r>
+              <w:rPr>
+                <w:rFonts w:ascii="Arial" w:hAnsi="Arial" w:cs="Arial"/>
+              </w:rPr>
+              <w:t xml:space="preserve">RF7</w:t>
+            </w:r>
+          </w:p>
+        </w:tc>
+        <w:tc>
+          <w:tcPr>
+            <w:tcW w:type="dxa" w:w="1474"/>
+          </w:tcPr>
+          <w:p>
+            <w:r>
+              <w:rPr>
+                <w:rFonts w:ascii="Arial" w:hAnsi="Arial" w:cs="Arial"/>
+              </w:rPr>
+              <w:t xml:space="preserve">Listado general con stock, precio y ganancia</w:t>
+            </w:r>
+          </w:p>
+        </w:tc>
+        <w:tc>
+          <w:tcPr>
+            <w:tcW w:type="dxa" w:w="4082"/>
+          </w:tcPr>
+          <w:p>
+            <w:r>
+              <w:rPr>
+                <w:rFonts w:ascii="Arial" w:hAnsi="Arial" w:cs="Arial"/>
+              </w:rPr>
+              <w:t xml:space="preserve">CP-GAN-002, CP-PROD-005</w:t>
+            </w:r>
+          </w:p>
+        </w:tc>
+        <w:tc>
+          <w:tcPr>
+            <w:tcW w:type="dxa" w:w="1134"/>
+          </w:tcPr>
+          <w:p>
+            <w:r>
+              <w:rPr>
+                <w:rFonts w:ascii="Arial" w:hAnsi="Arial" w:cs="Arial"/>
+              </w:rPr>
+              <w:t xml:space="preserve">Negra / Gris</w:t>
+            </w:r>
+          </w:p>
+        </w:tc>
+        <w:tc>
+          <w:tcPr>
+            <w:tcW w:type="dxa" w:w="1361"/>
+          </w:tcPr>
+          <w:p>
+            <w:r>
+              <w:rPr>
+                <w:rFonts w:ascii="Arial" w:hAnsi="Arial" w:cs="Arial"/>
+              </w:rPr>
+              <w:t xml:space="preserve">Aprobado</w:t>
+            </w:r>
+          </w:p>
+        </w:tc>
+      </w:tr>
+      <w:tr>
+        <w:tc>
+          <w:tcPr>
+            <w:tcW w:type="dxa" w:w="1474"/>
+          </w:tcPr>
+          <w:p>
+            <w:r>
+              <w:rPr>
+                <w:rFonts w:ascii="Arial" w:hAnsi="Arial" w:cs="Arial"/>
+              </w:rPr>
+              <w:t xml:space="preserve">RF8</w:t>
+            </w:r>
+          </w:p>
+        </w:tc>
+        <w:tc>
+          <w:tcPr>
+            <w:tcW w:type="dxa" w:w="1474"/>
+          </w:tcPr>
+          <w:p>
+            <w:r>
+              <w:rPr>
+                <w:rFonts w:ascii="Arial" w:hAnsi="Arial" w:cs="Arial"/>
+              </w:rPr>
+              <w:t xml:space="preserve">Diferenciar niveles de acceso (admin vs. empleado)</w:t>
+            </w:r>
+          </w:p>
+        </w:tc>
+        <w:tc>
+          <w:tcPr>
+            <w:tcW w:type="dxa" w:w="4082"/>
+          </w:tcPr>
+          <w:p>
+            <w:r>
+              <w:rPr>
+                <w:rFonts w:ascii="Arial" w:hAnsi="Arial" w:cs="Arial"/>
+              </w:rPr>
+              <w:t xml:space="preserve">CP-PROD-005</w:t>
+            </w:r>
+          </w:p>
+        </w:tc>
+        <w:tc>
+          <w:tcPr>
+            <w:tcW w:type="dxa" w:w="1134"/>
+          </w:tcPr>
+          <w:p>
+            <w:r>
+              <w:rPr>
+                <w:rFonts w:ascii="Arial" w:hAnsi="Arial" w:cs="Arial"/>
+              </w:rPr>
+              <w:t xml:space="preserve">Gris</w:t>
+            </w:r>
+          </w:p>
+        </w:tc>
+        <w:tc>
+          <w:tcPr>
+            <w:tcW w:type="dxa" w:w="1361"/>
+          </w:tcPr>
+          <w:p>
+            <w:r>
+              <w:rPr>
+                <w:rFonts w:ascii="Arial" w:hAnsi="Arial" w:cs="Arial"/>
+              </w:rPr>
+              <w:t xml:space="preserve">Aprobado</w:t>
+            </w:r>
+          </w:p>
+        </w:tc>
+      </w:tr>
+    </w:tbl>
+    <w:p>
+      <w:pPr>
+        <w:spacing w:before="0" w:after="120"/>
+      </w:pPr>
+      <w:r>
+        <w:rPr>
+          <w:rFonts w:ascii="Arial" w:hAnsi="Arial" w:cs="Arial"/>
+        </w:rPr>
+        <w:t xml:space="preserve">Cobertura adicional (fuera de los requisitos funcionales): Autenticación (auth.test.js — login/registro, soporta RF8) y Ventas/POS (ventas.test.js — fuera del alcance del proyecto, refuerza RF4). Estas pruebas se ejecutan en la misma corrida pero no corresponden a un RF del documento de objetivos.</w:t>
+      </w:r>
+    </w:p>
+    <w:p>
+      <w:pPr>
         <w:spacing w:before="0" w:after="80"/>
         <w:jc w:val="center"/>
       </w:pPr>
@@ -1782,7 +2439,7 @@
           <w:color w:val="1F3A8A"/>
           <w:sz w:val="25"/>
         </w:rPr>
-        <w:t>Módulo 1: Autenticación (Login y Registro) — archivo pruebas/auth.test.js</w:t>
+        <w:t xml:space="preserve">Módulo 1: Autenticación (Login y Registro) — archivo pruebas/auth.test.js  [Complementario — soporta RF8; no es un requisito funcional independiente]</w:t>
       </w:r>
     </w:p>
     <w:p>

</xml_diff>